<commit_message>
fix(cud): fix usecase specification
</commit_message>
<xml_diff>
--- a/RequirementAnalysis/UCSpec/word/CUDProduct.docx
+++ b/RequirementAnalysis/UCSpec/word/CUDProduct.docx
@@ -276,13 +276,7 @@
         <w:rPr>
           <w:rFonts w:ascii="Times New Roman" w:hAnsi="Times New Roman" w:cs="Times New Roman"/>
         </w:rPr>
-        <w:t xml:space="preserve">Product Manager </w:t>
-      </w:r>
-      <w:r>
-        <w:rPr>
-          <w:rFonts w:ascii="Times New Roman" w:hAnsi="Times New Roman" w:cs="Times New Roman"/>
-        </w:rPr>
-        <w:t xml:space="preserve">input general information and </w:t>
+        <w:t xml:space="preserve">Product Manager input general information and </w:t>
       </w:r>
       <w:proofErr w:type="gramStart"/>
       <w:r>
@@ -5075,12 +5069,181 @@
     </w:tbl>
     <w:p>
       <w:pPr>
+        <w:pStyle w:val="Heading1"/>
+      </w:pPr>
+      <w:r>
+        <w:t>Postconditions</w:t>
+      </w:r>
+    </w:p>
+    <w:p>
+      <w:pPr>
         <w:pStyle w:val="ListParagraph"/>
-        <w:ind w:left="360"/>
-        <w:rPr>
-          <w:rFonts w:ascii="Times New Roman" w:hAnsi="Times New Roman" w:cs="Times New Roman"/>
-        </w:rPr>
-      </w:pPr>
+        <w:numPr>
+          <w:ilvl w:val="0"/>
+          <w:numId w:val="11"/>
+        </w:numPr>
+        <w:rPr>
+          <w:rFonts w:ascii="Times New Roman" w:hAnsi="Times New Roman" w:cs="Times New Roman"/>
+        </w:rPr>
+      </w:pPr>
+      <w:r>
+        <w:rPr>
+          <w:rFonts w:ascii="Times New Roman" w:hAnsi="Times New Roman" w:cs="Times New Roman"/>
+        </w:rPr>
+        <w:t>Stored data: All products successfully saved into database or new information be updated with newest version.</w:t>
+      </w:r>
+    </w:p>
+    <w:p>
+      <w:pPr>
+        <w:pStyle w:val="ListParagraph"/>
+        <w:numPr>
+          <w:ilvl w:val="0"/>
+          <w:numId w:val="11"/>
+        </w:numPr>
+        <w:rPr>
+          <w:rFonts w:ascii="Times New Roman" w:hAnsi="Times New Roman" w:cs="Times New Roman"/>
+        </w:rPr>
+      </w:pPr>
+      <w:r>
+        <w:rPr>
+          <w:rFonts w:ascii="Times New Roman" w:hAnsi="Times New Roman" w:cs="Times New Roman"/>
+        </w:rPr>
+        <w:t>Inventory Accuracy: The stock quantity of product is accurately updated in system according to manual adjustment</w:t>
+      </w:r>
+    </w:p>
+    <w:p>
+      <w:pPr>
+        <w:pStyle w:val="ListParagraph"/>
+        <w:numPr>
+          <w:ilvl w:val="0"/>
+          <w:numId w:val="11"/>
+        </w:numPr>
+        <w:rPr>
+          <w:rFonts w:ascii="Times New Roman" w:hAnsi="Times New Roman" w:cs="Times New Roman"/>
+        </w:rPr>
+      </w:pPr>
+      <w:r>
+        <w:rPr>
+          <w:rFonts w:ascii="Times New Roman" w:hAnsi="Times New Roman" w:cs="Times New Roman"/>
+        </w:rPr>
+        <w:t xml:space="preserve">Product status: If product with zero stock was deleted, </w:t>
+      </w:r>
+      <w:proofErr w:type="gramStart"/>
+      <w:r>
+        <w:rPr>
+          <w:rFonts w:ascii="Times New Roman" w:hAnsi="Times New Roman" w:cs="Times New Roman"/>
+        </w:rPr>
+        <w:t>removed</w:t>
+      </w:r>
+      <w:proofErr w:type="gramEnd"/>
+      <w:r>
+        <w:rPr>
+          <w:rFonts w:ascii="Times New Roman" w:hAnsi="Times New Roman" w:cs="Times New Roman"/>
+        </w:rPr>
+        <w:t xml:space="preserve"> it from sales list, if its stock greater than zero, its status changed to </w:t>
+      </w:r>
+      <w:proofErr w:type="spellStart"/>
+      <w:r>
+        <w:rPr>
+          <w:rFonts w:ascii="Times New Roman" w:hAnsi="Times New Roman" w:cs="Times New Roman"/>
+        </w:rPr>
+        <w:t>Deactived</w:t>
+      </w:r>
+      <w:proofErr w:type="spellEnd"/>
+      <w:r>
+        <w:rPr>
+          <w:rFonts w:ascii="Times New Roman" w:hAnsi="Times New Roman" w:cs="Times New Roman"/>
+        </w:rPr>
+        <w:t>.</w:t>
+      </w:r>
+    </w:p>
+    <w:p>
+      <w:pPr>
+        <w:pStyle w:val="ListParagraph"/>
+        <w:numPr>
+          <w:ilvl w:val="0"/>
+          <w:numId w:val="11"/>
+        </w:numPr>
+        <w:rPr>
+          <w:rFonts w:ascii="Times New Roman" w:hAnsi="Times New Roman" w:cs="Times New Roman"/>
+        </w:rPr>
+      </w:pPr>
+      <w:r>
+        <w:rPr>
+          <w:rFonts w:ascii="Times New Roman" w:hAnsi="Times New Roman" w:cs="Times New Roman"/>
+        </w:rPr>
+        <w:t>Audit trail: A new record created in history, log the detail information of the operation</w:t>
+      </w:r>
+    </w:p>
+    <w:p>
+      <w:pPr>
+        <w:pStyle w:val="ListParagraph"/>
+        <w:numPr>
+          <w:ilvl w:val="0"/>
+          <w:numId w:val="11"/>
+        </w:numPr>
+        <w:rPr>
+          <w:rFonts w:ascii="Times New Roman" w:hAnsi="Times New Roman" w:cs="Times New Roman"/>
+        </w:rPr>
+      </w:pPr>
+      <w:r>
+        <w:rPr>
+          <w:rFonts w:ascii="Times New Roman" w:hAnsi="Times New Roman" w:cs="Times New Roman"/>
+        </w:rPr>
+        <w:t>Stock reason logging: Explicit reason is saved and linked to stock change record</w:t>
+      </w:r>
+    </w:p>
+    <w:p>
+      <w:pPr>
+        <w:pStyle w:val="ListParagraph"/>
+        <w:numPr>
+          <w:ilvl w:val="0"/>
+          <w:numId w:val="11"/>
+        </w:numPr>
+        <w:rPr>
+          <w:rFonts w:ascii="Times New Roman" w:hAnsi="Times New Roman" w:cs="Times New Roman"/>
+        </w:rPr>
+      </w:pPr>
+      <w:r>
+        <w:rPr>
+          <w:rFonts w:ascii="Times New Roman" w:hAnsi="Times New Roman" w:cs="Times New Roman"/>
+        </w:rPr>
+        <w:t xml:space="preserve">User notification: Product Manager receive notification from </w:t>
+      </w:r>
+      <w:proofErr w:type="gramStart"/>
+      <w:r>
+        <w:rPr>
+          <w:rFonts w:ascii="Times New Roman" w:hAnsi="Times New Roman" w:cs="Times New Roman"/>
+        </w:rPr>
+        <w:t>software</w:t>
+      </w:r>
+      <w:r>
+        <w:rPr>
+          <w:rFonts w:ascii="Times New Roman" w:hAnsi="Times New Roman" w:cs="Times New Roman"/>
+        </w:rPr>
+        <w:t>,</w:t>
+      </w:r>
+      <w:proofErr w:type="gramEnd"/>
+      <w:r>
+        <w:rPr>
+          <w:rFonts w:ascii="Times New Roman" w:hAnsi="Times New Roman" w:cs="Times New Roman"/>
+        </w:rPr>
+        <w:t xml:space="preserve"> product list interface must </w:t>
+      </w:r>
+      <w:proofErr w:type="gramStart"/>
+      <w:r>
+        <w:rPr>
+          <w:rFonts w:ascii="Times New Roman" w:hAnsi="Times New Roman" w:cs="Times New Roman"/>
+        </w:rPr>
+        <w:t>refreshed</w:t>
+      </w:r>
+      <w:proofErr w:type="gramEnd"/>
+      <w:r>
+        <w:rPr>
+          <w:rFonts w:ascii="Times New Roman" w:hAnsi="Times New Roman" w:cs="Times New Roman"/>
+        </w:rPr>
+        <w:t xml:space="preserve"> to display updated list</w:t>
+      </w:r>
     </w:p>
     <w:sectPr>
       <w:pgSz w:w="12240" w:h="15840"/>
@@ -5709,7 +5872,7 @@
   <w:abstractNum w:abstractNumId="6" w15:restartNumberingAfterBreak="0">
     <w:nsid w:val="3B2E00AA"/>
     <w:multiLevelType w:val="multilevel"/>
-    <w:tmpl w:val="A4E0A168"/>
+    <w:tmpl w:val="B792F3E6"/>
     <w:lvl w:ilvl="0">
       <w:start w:val="1"/>
       <w:numFmt w:val="decimal"/>
@@ -5954,6 +6117,119 @@
     </w:lvl>
   </w:abstractNum>
   <w:abstractNum w:abstractNumId="8" w15:restartNumberingAfterBreak="0">
+    <w:nsid w:val="6D132F5D"/>
+    <w:multiLevelType w:val="hybridMultilevel"/>
+    <w:tmpl w:val="9968977C"/>
+    <w:lvl w:ilvl="0" w:tplc="04090001">
+      <w:start w:val="1"/>
+      <w:numFmt w:val="bullet"/>
+      <w:lvlText w:val=""/>
+      <w:lvlJc w:val="left"/>
+      <w:pPr>
+        <w:ind w:left="720" w:hanging="360"/>
+      </w:pPr>
+      <w:rPr>
+        <w:rFonts w:ascii="Symbol" w:hAnsi="Symbol" w:hint="default"/>
+      </w:rPr>
+    </w:lvl>
+    <w:lvl w:ilvl="1" w:tplc="04090003" w:tentative="1">
+      <w:start w:val="1"/>
+      <w:numFmt w:val="bullet"/>
+      <w:lvlText w:val="o"/>
+      <w:lvlJc w:val="left"/>
+      <w:pPr>
+        <w:ind w:left="1440" w:hanging="360"/>
+      </w:pPr>
+      <w:rPr>
+        <w:rFonts w:ascii="Courier New" w:hAnsi="Courier New" w:cs="Courier New" w:hint="default"/>
+      </w:rPr>
+    </w:lvl>
+    <w:lvl w:ilvl="2" w:tplc="04090005" w:tentative="1">
+      <w:start w:val="1"/>
+      <w:numFmt w:val="bullet"/>
+      <w:lvlText w:val=""/>
+      <w:lvlJc w:val="left"/>
+      <w:pPr>
+        <w:ind w:left="2160" w:hanging="360"/>
+      </w:pPr>
+      <w:rPr>
+        <w:rFonts w:ascii="Wingdings" w:hAnsi="Wingdings" w:hint="default"/>
+      </w:rPr>
+    </w:lvl>
+    <w:lvl w:ilvl="3" w:tplc="04090001" w:tentative="1">
+      <w:start w:val="1"/>
+      <w:numFmt w:val="bullet"/>
+      <w:lvlText w:val=""/>
+      <w:lvlJc w:val="left"/>
+      <w:pPr>
+        <w:ind w:left="2880" w:hanging="360"/>
+      </w:pPr>
+      <w:rPr>
+        <w:rFonts w:ascii="Symbol" w:hAnsi="Symbol" w:hint="default"/>
+      </w:rPr>
+    </w:lvl>
+    <w:lvl w:ilvl="4" w:tplc="04090003" w:tentative="1">
+      <w:start w:val="1"/>
+      <w:numFmt w:val="bullet"/>
+      <w:lvlText w:val="o"/>
+      <w:lvlJc w:val="left"/>
+      <w:pPr>
+        <w:ind w:left="3600" w:hanging="360"/>
+      </w:pPr>
+      <w:rPr>
+        <w:rFonts w:ascii="Courier New" w:hAnsi="Courier New" w:cs="Courier New" w:hint="default"/>
+      </w:rPr>
+    </w:lvl>
+    <w:lvl w:ilvl="5" w:tplc="04090005" w:tentative="1">
+      <w:start w:val="1"/>
+      <w:numFmt w:val="bullet"/>
+      <w:lvlText w:val=""/>
+      <w:lvlJc w:val="left"/>
+      <w:pPr>
+        <w:ind w:left="4320" w:hanging="360"/>
+      </w:pPr>
+      <w:rPr>
+        <w:rFonts w:ascii="Wingdings" w:hAnsi="Wingdings" w:hint="default"/>
+      </w:rPr>
+    </w:lvl>
+    <w:lvl w:ilvl="6" w:tplc="04090001" w:tentative="1">
+      <w:start w:val="1"/>
+      <w:numFmt w:val="bullet"/>
+      <w:lvlText w:val=""/>
+      <w:lvlJc w:val="left"/>
+      <w:pPr>
+        <w:ind w:left="5040" w:hanging="360"/>
+      </w:pPr>
+      <w:rPr>
+        <w:rFonts w:ascii="Symbol" w:hAnsi="Symbol" w:hint="default"/>
+      </w:rPr>
+    </w:lvl>
+    <w:lvl w:ilvl="7" w:tplc="04090003" w:tentative="1">
+      <w:start w:val="1"/>
+      <w:numFmt w:val="bullet"/>
+      <w:lvlText w:val="o"/>
+      <w:lvlJc w:val="left"/>
+      <w:pPr>
+        <w:ind w:left="5760" w:hanging="360"/>
+      </w:pPr>
+      <w:rPr>
+        <w:rFonts w:ascii="Courier New" w:hAnsi="Courier New" w:cs="Courier New" w:hint="default"/>
+      </w:rPr>
+    </w:lvl>
+    <w:lvl w:ilvl="8" w:tplc="04090005" w:tentative="1">
+      <w:start w:val="1"/>
+      <w:numFmt w:val="bullet"/>
+      <w:lvlText w:val=""/>
+      <w:lvlJc w:val="left"/>
+      <w:pPr>
+        <w:ind w:left="6480" w:hanging="360"/>
+      </w:pPr>
+      <w:rPr>
+        <w:rFonts w:ascii="Wingdings" w:hAnsi="Wingdings" w:hint="default"/>
+      </w:rPr>
+    </w:lvl>
+  </w:abstractNum>
+  <w:abstractNum w:abstractNumId="9" w15:restartNumberingAfterBreak="0">
     <w:nsid w:val="77443FDD"/>
     <w:multiLevelType w:val="multilevel"/>
     <w:tmpl w:val="81C00C7C"/>
@@ -6115,7 +6391,7 @@
     <w:abstractNumId w:val="5"/>
   </w:num>
   <w:num w:numId="6" w16cid:durableId="709456235">
-    <w:abstractNumId w:val="8"/>
+    <w:abstractNumId w:val="9"/>
   </w:num>
   <w:num w:numId="7" w16cid:durableId="982928697">
     <w:abstractNumId w:val="7"/>
@@ -6128,6 +6404,9 @@
   </w:num>
   <w:num w:numId="10" w16cid:durableId="269360066">
     <w:abstractNumId w:val="1"/>
+  </w:num>
+  <w:num w:numId="11" w16cid:durableId="1208638068">
+    <w:abstractNumId w:val="8"/>
   </w:num>
 </w:numbering>
 </file>
@@ -6541,7 +6820,7 @@
     <w:autoRedefine/>
     <w:uiPriority w:val="9"/>
     <w:qFormat/>
-    <w:rsid w:val="007E487F"/>
+    <w:rsid w:val="004914A0"/>
     <w:pPr>
       <w:keepNext/>
       <w:keepLines/>
@@ -6769,6 +7048,7 @@
   <w:style w:type="character" w:default="1" w:styleId="DefaultParagraphFont">
     <w:name w:val="Default Paragraph Font"/>
     <w:uiPriority w:val="1"/>
+    <w:semiHidden/>
     <w:unhideWhenUsed/>
   </w:style>
   <w:style w:type="table" w:default="1" w:styleId="TableNormal">
@@ -6797,7 +7077,7 @@
     <w:basedOn w:val="DefaultParagraphFont"/>
     <w:link w:val="Heading1"/>
     <w:uiPriority w:val="9"/>
-    <w:rsid w:val="007E487F"/>
+    <w:rsid w:val="004914A0"/>
     <w:rPr>
       <w:rFonts w:ascii="Times New Roman" w:eastAsiaTheme="majorEastAsia" w:hAnsi="Times New Roman" w:cs="Times New Roman"/>
       <w:b/>

</xml_diff>